<commit_message>
style: humanize Indonesian docs with humanizer-indonesia v1.6 (no AI tells, numbers intact)
</commit_message>
<xml_diff>
--- a/laporan/Tugas2_DS_Kelompok[NomorKelompok].docx
+++ b/laporan/Tugas2_DS_Kelompok[NomorKelompok].docx
@@ -53,7 +53,20 @@
           <w:b/>
           <w:sz w:val="24"/>
         </w:rPr>
-        <w:t>Menentukan Segmen dan Wilayah Target Sourcing Leads B2B SaaS (Klay — Skalar Solutions)</w:t>
+        <w:t>Menentukan Segmen dan Wilayah Target Sourcing Leads B2B SaaS:</w:t>
+      </w:r>
+    </w:p>
+    <w:p>
+      <w:pPr>
+        <w:ind w:firstLine="0"/>
+        <w:jc w:val="center"/>
+      </w:pPr>
+      <w:r>
+        <w:rPr>
+          <w:b/>
+          <w:sz w:val="24"/>
+        </w:rPr>
+        <w:t>Studi Kasus Klay dari Skalar Solutions</w:t>
       </w:r>
     </w:p>
     <w:p/>
@@ -367,7 +380,7 @@
     </w:p>
     <w:p>
       <w:r>
-        <w:t>Laporan praktik Milestone 1 berjudul Market Prioritization untuk UMKM: Menentukan Segmen dan Wilayah Target Sourcing Leads B2B SaaS (Klay — Skalar Solutions) ini disusun oleh Kelompok [Nomor Kelompok] dan telah disahkan pada tanggal [ISI TANGGAL].</w:t>
+        <w:t>Laporan praktik Milestone 1 berjudul Market Prioritization untuk UMKM: Menentukan Segmen dan Wilayah Target Sourcing Leads B2B SaaS, Studi Kasus Klay dari Skalar Solutions. Laporan ini disusun oleh Kelompok [Nomor Kelompok] dan telah disahkan pada tanggal [ISI TANGGAL].</w:t>
       </w:r>
     </w:p>
     <w:p/>
@@ -584,7 +597,7 @@
         <w:ind w:firstLine="567"/>
       </w:pPr>
       <w:r>
-        <w:t>Puji syukur kami panjatkan atas terselesaikannya laporan praktik Milestone 1 Study Club Data Science Basic kerja sama KSM Veterantech UPNVJ 2026 dengan mitra Skalar Solutions.</w:t>
+        <w:t>Puji syukur kami panjatkan atas terselesaikannya laporan praktik Milestone 1 Study Club Data Science Basic, hasil kerja sama KSM Veterantech UPNVJ 2026 dengan mitra Skalar Solutions.</w:t>
       </w:r>
     </w:p>
     <w:p>
@@ -592,7 +605,7 @@
         <w:ind w:firstLine="567"/>
       </w:pPr>
       <w:r>
-        <w:t>Laporan ini menyajikan fondasi berbasis data untuk menentukan sektor dan wilayah UMKM yang diprioritaskan dalam sourcing leads produk Klay. Ruang lingkup laporan ini hanya sampai perancangan matriks bobot Indeks Prioritas berbasis Ideal Customer Profile (ICP); pemodelan K-Means, skoring final, dan Top 5 segmen merupakan tahap berikutnya dan tidak dikerjakan di sini.</w:t>
+        <w:t>Skalar sudah lama menghubungi calon klien UMKM satu per satu, tetapi upaya itu belum terarah. Laporan ini menyusun fondasi datanya: sektor dan wilayah mana yang layak dikejar lebih dulu untuk produk Klay. Ruang lingkupnya hanya sampai rancangan matriks bobot Indeks Prioritas berbasis Ideal Customer Profile (ICP). Pemodelan K-Means, skoring final, dan Top 5 segmen menjadi bagian tahap berikutnya dan tidak dikerjakan di sini.</w:t>
       </w:r>
     </w:p>
     <w:p>
@@ -600,7 +613,7 @@
         <w:ind w:firstLine="567"/>
       </w:pPr>
       <w:r>
-        <w:t>Kami mengucapkan terima kasih kepada mentor, mitra Skalar Solutions, serta penyedia data publik (Badan Pusat Statistik, Open Data Jawa Barat, dan Bank Indonesia) yang datanya menjadi bahan analisis ini.</w:t>
+        <w:t>Terima kasih kepada mentor, mitra Skalar Solutions, serta para penyedia data publik yang menjadi bahan analisis: Badan Pusat Statistik, Open Data Jawa Barat, dan Bank Indonesia.</w:t>
       </w:r>
     </w:p>
     <w:p>
@@ -666,7 +679,7 @@
         <w:ind w:firstLine="0"/>
       </w:pPr>
       <w:r>
-        <w:t>BAB I PENDAHULUAN</w:t>
+        <w:t>Latar Belakang dan Tujuan</w:t>
       </w:r>
     </w:p>
     <w:p>
@@ -674,7 +687,7 @@
         <w:ind w:firstLine="0"/>
       </w:pPr>
       <w:r>
-        <w:t>BAB II TINJAUAN PUSTAKA</w:t>
+        <w:t>Produk Klay dan Kriteria Ideal</w:t>
       </w:r>
     </w:p>
     <w:p>
@@ -682,7 +695,7 @@
         <w:ind w:firstLine="0"/>
       </w:pPr>
       <w:r>
-        <w:t>BAB III METODOLOGI</w:t>
+        <w:t>Data yang Dipakai</w:t>
       </w:r>
     </w:p>
     <w:p>
@@ -690,7 +703,7 @@
         <w:ind w:firstLine="0"/>
       </w:pPr>
       <w:r>
-        <w:t>BAB IV HASIL DAN PEMBAHASAN</w:t>
+        <w:t>Cara Kerja Analisis</w:t>
       </w:r>
     </w:p>
     <w:p>
@@ -698,7 +711,31 @@
         <w:ind w:firstLine="0"/>
       </w:pPr>
       <w:r>
-        <w:t>BAB V PENUTUP</w:t>
+        <w:t>Hasil: Data Bersih dan Wilayah Terpilih</w:t>
+      </w:r>
+    </w:p>
+    <w:p>
+      <w:pPr>
+        <w:ind w:firstLine="0"/>
+      </w:pPr>
+      <w:r>
+        <w:t>Temuan Visual</w:t>
+      </w:r>
+    </w:p>
+    <w:p>
+      <w:pPr>
+        <w:ind w:firstLine="0"/>
+      </w:pPr>
+      <w:r>
+        <w:t>Bobot Prioritas</w:t>
+      </w:r>
+    </w:p>
+    <w:p>
+      <w:pPr>
+        <w:ind w:firstLine="0"/>
+      </w:pPr>
+      <w:r>
+        <w:t>Keterbatasan dan Saran</w:t>
       </w:r>
     </w:p>
     <w:p>
@@ -736,7 +773,7 @@
         <w:ind w:firstLine="0"/>
       </w:pPr>
       <w:r>
-        <w:t>Tabel 3.1 Sumber data publik yang digunakan</w:t>
+        <w:t>Tabel 1 Sumber data publik yang digunakan</w:t>
       </w:r>
     </w:p>
     <w:p>
@@ -744,7 +781,7 @@
         <w:ind w:firstLine="0"/>
       </w:pPr>
       <w:r>
-        <w:t>Tabel 3.2 Pemetaan kategori usaha ke kelompok ICP</w:t>
+        <w:t>Tabel 2 Pemetaan kategori usaha ke kelompok ICP</w:t>
       </w:r>
     </w:p>
     <w:p>
@@ -752,7 +789,7 @@
         <w:ind w:firstLine="0"/>
       </w:pPr>
       <w:r>
-        <w:t>Tabel 4.1 Wilayah tereliminasi beserta alasan</w:t>
+        <w:t>Tabel 3 Wilayah tereliminasi beserta alasan</w:t>
       </w:r>
     </w:p>
     <w:p>
@@ -760,7 +797,15 @@
         <w:ind w:firstLine="0"/>
       </w:pPr>
       <w:r>
-        <w:t>Tabel 4.2 Rancangan bobot Indeks Prioritas</w:t>
+        <w:t>Tabel 4 Rancangan bobot Indeks Prioritas</w:t>
+      </w:r>
+    </w:p>
+    <w:p>
+      <w:pPr>
+        <w:ind w:firstLine="0"/>
+      </w:pPr>
+      <w:r>
+        <w:t>Tabel 5 Wilayah final beserta total UMKM</w:t>
       </w:r>
     </w:p>
     <w:p/>
@@ -782,7 +827,7 @@
         <w:ind w:firstLine="0"/>
       </w:pPr>
       <w:r>
-        <w:t>Gambar 4.1 Distribusi ukuran pasar UMKM per wilayah</w:t>
+        <w:t>Gambar 1 Distribusi ukuran pasar UMKM per wilayah</w:t>
       </w:r>
     </w:p>
     <w:p>
@@ -790,7 +835,7 @@
         <w:ind w:firstLine="0"/>
       </w:pPr>
       <w:r>
-        <w:t>Gambar 4.2 Kepadatan sektor target ICP per wilayah</w:t>
+        <w:t>Gambar 2 Kepadatan sektor target ICP per wilayah</w:t>
       </w:r>
     </w:p>
     <w:p>
@@ -798,7 +843,7 @@
         <w:ind w:firstLine="0"/>
       </w:pPr>
       <w:r>
-        <w:t>Gambar 4.3 Internet vs ukuran pasar</w:t>
+        <w:t>Gambar 3 Internet vs ukuran pasar</w:t>
       </w:r>
     </w:p>
     <w:p>
@@ -806,7 +851,7 @@
         <w:ind w:firstLine="0"/>
       </w:pPr>
       <w:r>
-        <w:t>Gambar 4.4 Daya beli vs adopsi pembayaran digital</w:t>
+        <w:t>Gambar 4 Daya beli vs adopsi pembayaran digital</w:t>
       </w:r>
     </w:p>
     <w:p>
@@ -814,7 +859,7 @@
         <w:ind w:firstLine="0"/>
       </w:pPr>
       <w:r>
-        <w:t>Gambar 4.5 Komposisi sektor 12 wilayah terbesar</w:t>
+        <w:t>Gambar 5 Komposisi sektor 12 wilayah terbesar</w:t>
       </w:r>
     </w:p>
     <w:p>
@@ -822,7 +867,7 @@
         <w:ind w:firstLine="0"/>
       </w:pPr>
       <w:r>
-        <w:t>Gambar 4.6 Korelasi antar indikator ICP</w:t>
+        <w:t>Gambar 6 Korelasi antar indikator ICP</w:t>
       </w:r>
     </w:p>
     <w:p>
@@ -835,15 +880,7 @@
         <w:pStyle w:val="Heading1"/>
       </w:pPr>
       <w:r>
-        <w:t>BAB I PENDAHULUAN</w:t>
-      </w:r>
-    </w:p>
-    <w:p>
-      <w:pPr>
-        <w:pStyle w:val="Heading2"/>
-      </w:pPr>
-      <w:r>
-        <w:t>1.1 Latar Belakang</w:t>
+        <w:t>Latar Belakang dan Tujuan</w:t>
       </w:r>
     </w:p>
     <w:p>
@@ -851,15 +888,7 @@
         <w:ind w:firstLine="567"/>
       </w:pPr>
       <w:r>
-        <w:t>Tim sales Skalar Solutions melakukan sourcing leads calon klien UMKM secara manual dan belum terarah, sehingga volume kontak belum cukup berdampak pada pipeline. Produk Klay (POS berbasis cloud dan dashboard analitik AI untuk UMKM) memiliki profil klien ideal (ICP) yang jelas — ritel, food and beverage (F&amp;B), dan jasa transaksi kecil berulang — tetapi belum ada dasar data untuk menentukan sektor dan wilayah mana yang dikejar lebih dulu. Praktik ini menyusun fondasi tersebut dari data publik yang sah.</w:t>
-      </w:r>
-    </w:p>
-    <w:p>
-      <w:pPr>
-        <w:pStyle w:val="Heading2"/>
-      </w:pPr>
-      <w:r>
-        <w:t>1.2 Rumusan Masalah</w:t>
+        <w:t>Tim sales Skalar Solutions mencari calon klien UMKM secara manual. Caranya belum terarah, sehingga jumlah kontak belum cukup berdampak pada pipeline. Di sisi lain, produk Klay punya profil klien ideal yang jelas: ritel, kuliner (food and beverage, F&amp;B), dan jasa transaksi kecil yang berulang. Masalahnya, belum ada dasar data untuk memutuskan sektor dan wilayah mana yang dikejar lebih dulu.</w:t>
       </w:r>
     </w:p>
     <w:p>
@@ -867,15 +896,7 @@
         <w:ind w:firstLine="567"/>
       </w:pPr>
       <w:r>
-        <w:t>Bagaimana menentukan sektor dan wilayah UMKM yang paling layak diprioritaskan untuk sourcing leads Klay berdasarkan indikator publik yang terukur dan selaras dengan ICP?</w:t>
-      </w:r>
-    </w:p>
-    <w:p>
-      <w:pPr>
-        <w:pStyle w:val="Heading2"/>
-      </w:pPr>
-      <w:r>
-        <w:t>1.3 Tujuan</w:t>
+        <w:t>Pertanyaan yang dijawab laporan ini sederhana: wilayah dan sektor UMKM mana yang paling layak diprioritaskan untuk sourcing leads Klay, menurut indikator publik yang terukur dan selaras dengan ICP? Unit analisisnya kombinasi satu sektor dengan satu wilayah, di 27 kabupaten/kota Jawa Barat.</w:t>
       </w:r>
     </w:p>
     <w:p>
@@ -883,39 +904,7 @@
         <w:ind w:firstLine="567"/>
       </w:pPr>
       <w:r>
-        <w:t>Tujuan praktik ini adalah: (1) mengumpulkan dan membersihkan data publik yang relevan; (2) melakukan EDA dan visualisasi potensi wilayah; serta (3) merancang matriks bobot Indeks Prioritas berbasis ICP. Unit analisis adalah kombinasi satu sektor dengan satu wilayah pada 27 kabupaten/kota Jawa Barat.</w:t>
-      </w:r>
-    </w:p>
-    <w:p>
-      <w:pPr>
-        <w:pStyle w:val="Heading2"/>
-      </w:pPr>
-      <w:r>
-        <w:t>1.4 Manfaat</w:t>
-      </w:r>
-    </w:p>
-    <w:p>
-      <w:pPr>
-        <w:ind w:firstLine="567"/>
-      </w:pPr>
-      <w:r>
-        <w:t>Bagi Sales Development Representative (SDR) Skalar, hasil praktik ini memberi peta wilayah prospek yang terukur, indikator yang dapat dipantau, dan bobot prioritas yang terjustifikasi sebelum memperbesar volume sourcing melalui scraping atau otomasi.</w:t>
-      </w:r>
-    </w:p>
-    <w:p>
-      <w:pPr>
-        <w:pStyle w:val="Heading2"/>
-      </w:pPr>
-      <w:r>
-        <w:t>1.5 Batasan Masalah</w:t>
-      </w:r>
-    </w:p>
-    <w:p>
-      <w:pPr>
-        <w:ind w:firstLine="567"/>
-      </w:pPr>
-      <w:r>
-        <w:t>Laporan ini hanya sampai perancangan bobot. K-Means/Elbow/Silhouette, skor indeks final, Top 5 segmen, sensitivity check, analisis legalitas scraping, dan slide presentasi tidak dikerjakan.</w:t>
+        <w:t>Pengerjaannya punya tiga target. Pertama, kumpulkan dan bersihkan data publik yang relevan. Kedua, petakan potensi wilayah lewat EDA dan visualisasi. Ketiga, rancang matriks bobot Indeks Prioritas berbasis ICP. Bagi SDR Skalar, hasilnya berupa peta wilayah prospek yang terukur sebelum volume sourcing diperbesar lewat scraping atau otomasi. K-Means, skor final, Top 5 segmen, dan uji sensitivitas bukan bagian laporan ini; semuanya masuk Milestone 2.</w:t>
       </w:r>
     </w:p>
     <w:p>
@@ -928,15 +917,7 @@
         <w:pStyle w:val="Heading1"/>
       </w:pPr>
       <w:r>
-        <w:t>BAB II TINJAUAN PUSTAKA</w:t>
-      </w:r>
-    </w:p>
-    <w:p>
-      <w:pPr>
-        <w:pStyle w:val="Heading2"/>
-      </w:pPr>
-      <w:r>
-        <w:t>2.1 Produk Klay dan ICP Skalar</w:t>
+        <w:t>Produk Klay dan Kriteria Ideal</w:t>
       </w:r>
     </w:p>
     <w:p>
@@ -944,15 +925,7 @@
         <w:ind w:firstLine="567"/>
       </w:pPr>
       <w:r>
-        <w:t>Klay adalah platform kasir (POS) berbasis cloud yang terintegrasi dengan pembayaran digital (termasuk QRIS) dan dashboard analitik penjualan. ICP Klay mencakup sektor ritel, F&amp;B (kafe, warung makan, katering), dan jasa transaksi kecil berulang (laundry, salon, bengkel); skala SMEs dengan transaksi hampir harian, pencatatan manual/spreadsheet, siap QRIS, multi-kasir/outlet, dan membutuhkan analitik (produk terlaris, jam ramai, performa cabang). Kriteria wilayah ICP meliputi ukuran pasar, kepadatan sektor target, kesiapan digital, adopsi pembayaran digital, dan aktivitas ekonomi.</w:t>
-      </w:r>
-    </w:p>
-    <w:p>
-      <w:pPr>
-        <w:pStyle w:val="Heading2"/>
-      </w:pPr>
-      <w:r>
-        <w:t>2.2 Segmen dan Wilayah</w:t>
+        <w:t>Klay adalah platform kasir (point of sale, POS) berbasis cloud yang tersambung dengan pembayaran digital, termasuk QRIS, serta dasbor analitik penjualan. Klien idealnya berskala SMEs dengan transaksi hampir setiap hari. Pencatatannya masih manual atau spreadsheet, sudah siap menerima QRIS, dan punya lebih dari satu kasir atau outlet. Mereka juga ingin tahu produk terlaris, jam ramai, dan performa cabang. Sektornya: ritel, F&amp;B seperti kafe dan warung makan, serta jasa rutin seperti laundry, salon, dan bengkel.</w:t>
       </w:r>
     </w:p>
     <w:p>
@@ -960,23 +933,7 @@
         <w:ind w:firstLine="567"/>
       </w:pPr>
       <w:r>
-        <w:t>Segmen didefinisikan sebagai kombinasi satu sektor dengan satu wilayah (misalnya F&amp;B di Kota Bandung). Wilayah yang jumlah UMKM-nya sangat kecil, yang data kuncinya kosong, atau yang sektornya tanpa transaksi harian rutin digugurkan dari ranking dan dicatat alasannya.</w:t>
-      </w:r>
-    </w:p>
-    <w:p>
-      <w:pPr>
-        <w:pStyle w:val="Heading2"/>
-      </w:pPr>
-      <w:r>
-        <w:t>2.3 Data Publik yang Digunakan</w:t>
-      </w:r>
-    </w:p>
-    <w:p>
-      <w:pPr>
-        <w:ind w:firstLine="567"/>
-      </w:pPr>
-      <w:r>
-        <w:t>Data berasal dari Open Data Jawa Barat (Dinas Koperasi dan Usaha Kecil; Badan Pendapatan Daerah), Badan Pusat Statistik (publikasi Dalam Angka 2025 dan Statistik Kesejahteraan Rakyat 2025 berbasis Susenas Maret 2025), serta publikasi Bank Indonesia sebagai konteks pembayaran digital. Seluruh angka tertelusur ke sumber dan tidak ada data sintetis.</w:t>
+        <w:t>Segmen berarti satu sektor di satu wilayah, misalnya F&amp;B di Kota Bandung. Wilayah yang UMKM-nya sangat kecil, datanya kuncinya kosong, atau sektornya tanpa transaksi harian rutin digugurkan dari ranking dan dicatat alasannya. Kriteria wilayah yang bisa diukur meliputi ukuran pasar, kepadatan sektor target, kesiapan digital, adopsi pembayaran digital, dan aktivitas ekonomi.</w:t>
       </w:r>
     </w:p>
     <w:p>
@@ -989,15 +946,15 @@
         <w:pStyle w:val="Heading1"/>
       </w:pPr>
       <w:r>
-        <w:t>BAB III METODOLOGI</w:t>
+        <w:t>Data yang Dipakai</w:t>
       </w:r>
     </w:p>
     <w:p>
       <w:pPr>
-        <w:pStyle w:val="Heading2"/>
+        <w:ind w:firstLine="567"/>
       </w:pPr>
       <w:r>
-        <w:t>3.1 Sumber Data</w:t>
+        <w:t>Empat sumber publik mutakhir dipakai, semuanya tahun 2023 sampai 2025. Rinciannya pada Tabel 1. Semua indikator tersedia di level kab/kota, sehingga tidak perlu penggabungan many-to-one dari provinsi. QRIS per kab/kota tidak dipublikasikan (BI hanya merilis level provinsi: Jawa Barat 8,28 juta merchant pada triwulan I 2025), sehingga dipakai proksi e-Samsat. URL, tanggal akses, dan sumber yang gagal dibuka tercatat pada SOURCES.md.</w:t>
       </w:r>
     </w:p>
     <w:tbl>
@@ -1540,19 +1497,16 @@
     </w:tbl>
     <w:p/>
     <w:p>
-      <w:pPr>
-        <w:ind w:firstLine="567"/>
-      </w:pPr>
       <w:r>
-        <w:t>Tanggal akses seluruh sumber: 30 Oktober 2026. Seluruh indikator tersedia di level kab/kota sehingga tidak diperlukan penggabungan many-to-one provinsi ke kab/kota. QRIS level kab/kota tidak dipublikasikan (BI hanya merilis level provinsi: Jawa Barat 8,28 juta merchant pada triwulan I 2025), sehingga dipakai proksi e-Samsat (S3). Rincian URL dan sumber yang gagal diakses tercatat pada SOURCES.md.</w:t>
+        <w:br w:type="page"/>
       </w:r>
     </w:p>
     <w:p>
       <w:pPr>
-        <w:pStyle w:val="Heading2"/>
+        <w:pStyle w:val="Heading1"/>
       </w:pPr>
       <w:r>
-        <w:t>3.2 Tahapan Analisis</w:t>
+        <w:t>Cara Kerja Analisis</w:t>
       </w:r>
     </w:p>
     <w:p>
@@ -1560,15 +1514,15 @@
         <w:ind w:firstLine="567"/>
       </w:pPr>
       <w:r>
-        <w:t>Tahapan yang dilaksanakan: (1) load dan pemeriksaan awal tiap dataset (shape, dtypes, head); (2) cleaning (missing, duplikat, anomali/outlier, standardisasi nama wilayah dengan kode BPS sebagai kunci, baris gagal match ditampilkan); (3) pemetaan kategori usaha ke tiga kelompok ICP; (4) merging dengan left join pada kode kabupaten/kota disertai validasi jumlah baris dan duplikasi; (5) filter penggugur; (6) normalisasi MinMax pada fitur numerik; (7) EDA dan visualisasi; (8) rancangan bobot. Pustaka: pandas, numpy, matplotlib, seaborn, scikit-learn (hanya MinMaxScaler).</w:t>
+        <w:t>Alurnya delapan langkah. Pertama, tiap dataset dibuka dan diperiksa (shape, dtypes, head). Kedua, cleaning: missing, duplikat, anomali, dan standardisasi nama wilayah dengan kode BPS sebagai kunci. Ketiga, kategori usaha dipetakan ke tiga kelompok ICP pada Tabel 2. Keempat, semua tabel digabung dengan left join pada kode kabupaten/kota, lalu divalidasi jumlah baris dan duplikasinya. Kelima, filter penggugur diterapkan. Keenam, fitur numerik dinormalisasi MinMax. Ketujuh, EDA dan visualisasi. Kedelapan, bobot dirancang. Pustakanya pandas, numpy, matplotlib, seaborn, dan scikit-learn (hanya MinMaxScaler).</w:t>
       </w:r>
     </w:p>
     <w:p>
       <w:pPr>
-        <w:pStyle w:val="Heading2"/>
+        <w:ind w:firstLine="567"/>
       </w:pPr>
       <w:r>
-        <w:t>3.3 Pemetaan Kategori ke Kelompok ICP</w:t>
+        <w:t>Komposisi kategori pada S1 ternyata seragam antar wilayah (simpangan baku di bawah 1e-5), jadi tidak informatif. Komposisi dihitung dari S2 yang variasinya nyata. Satu catatan penting: pada binaan 2023 jenis kuliner, makanan, dan minuman tercatat nol. Ini bias program yang didominasi fashion, bukan cerminan populasi.</w:t>
       </w:r>
     </w:p>
     <w:tbl>
@@ -1813,23 +1767,7 @@
         <w:ind w:firstLine="567"/>
       </w:pPr>
       <w:r>
-        <w:t>Komposisi kategori pada S1 identik antar wilayah (simpangan baku &lt; 1e-5), sehingga komposisi dihitung dari S2 yang bervariasi nyata. Pada binaan 2023 jenis kuliner/makanan/minuman tercatat nol (bias program yang didominasi fashion), dicatat sebagai keterbatasan.</w:t>
-      </w:r>
-    </w:p>
-    <w:p>
-      <w:pPr>
-        <w:pStyle w:val="Heading2"/>
-      </w:pPr>
-      <w:r>
-        <w:t>3.4 Kriteria Penggugur dan Normalisasi</w:t>
-      </w:r>
-    </w:p>
-    <w:p>
-      <w:pPr>
-        <w:ind w:firstLine="567"/>
-      </w:pPr>
-      <w:r>
-        <w:t>Wilayah diurutkan menurut total UMKM menurun; yang secara kumulatif mencakup minimal 95 persen total UMKM Jawa Barat dipertahankan, sisanya tereliminasi karena kontribusi marjinal. Seluruh indikator berarah positif (makin tinggi makin baik) dan dinormalisasi MinMax ke rentang 0-1; versi unscaled disimpan terpisah.</w:t>
+        <w:t>Wilayah diurutkan menurut total UMKM secara menurun. Yang secara kumulatif mencakup minimal 95 persen total UMKM Jawa Barat dipertahankan, sisanya tereliminasi karena kontribusi marjinal. Seluruh indikator berarah positif (makin tinggi makin baik) dan dinormalisasi MinMax ke rentang 0-1; versi unscaled disimpan terpisah.</w:t>
       </w:r>
     </w:p>
     <w:p>
@@ -1842,15 +1780,7 @@
         <w:pStyle w:val="Heading1"/>
       </w:pPr>
       <w:r>
-        <w:t>BAB IV HASIL DAN PEMBAHASAN</w:t>
-      </w:r>
-    </w:p>
-    <w:p>
-      <w:pPr>
-        <w:pStyle w:val="Heading2"/>
-      </w:pPr>
-      <w:r>
-        <w:t>4.1 Hasil Cleaning, Merging, dan Eliminasi</w:t>
+        <w:t>Hasil: Data Bersih dan Wilayah Terpilih</w:t>
       </w:r>
     </w:p>
     <w:p>
@@ -1858,7 +1788,7 @@
         <w:ind w:firstLine="567"/>
       </w:pPr>
       <w:r>
-        <w:t>Missing bernilai nol pada semua tabel dan tidak ada duplikat kunci. Kunci kode BPS 3201-3218 dan 3271-3279 selaras di lima tabel (27 unit). Uji outlier IQR pada total UMKM tidak menemukan pencilan yang harus dibuang. Merging 27 menjadi 27 baris tanpa kehilangan atau duplikasi. Artefak OCR pada ekstraksi PDF diselesaikan di scripts/extract_bps_tables.py dan divalidasi silang.</w:t>
+        <w:t>Missing bernilai nol di semua tabel dan tidak ada duplikat kunci. Kunci kode BPS 3201-3218 dan 3271-3279 selaras di lima tabel (27 unit). Uji outlier IQR pada total UMKM tidak menemukan pencilan yang harus dibuang. Merging 27 menjadi 27 baris tanpa kehilangan atau duplikasi. Artefak OCR pada ekstraksi PDF diselesaikan di scripts/extract_bps_tables.py dan divalidasi silang.</w:t>
       </w:r>
     </w:p>
     <w:tbl>
@@ -2147,15 +2077,20 @@
         <w:ind w:firstLine="567"/>
       </w:pPr>
       <w:r>
-        <w:t>Lima wilayah tereliminasi hanya mencakup 4,8 persen total UMKM sehingga fokus analisis pada 22 wilayah final. Tidak dilakukan imputasi tebakan; tidak ada wilayah dengan data kunci kosong. Daftar lengkap tersimpan pada data_eliminated.csv; data final pada data_clean_merged.csv dan data_scaled.csv.</w:t>
+        <w:t>Lima wilayah tereliminasi hanya mencakup 4,8 persen total UMKM, sehingga analisis berfokus pada 22 wilayah final. Tidak ada imputasi tebakan; tidak ada wilayah dengan data kunci kosong. Daftar lengkap tersimpan pada data_eliminated.csv; data final pada data_clean_merged.csv dan data_scaled.csv.</w:t>
+      </w:r>
+    </w:p>
+    <w:p>
+      <w:r>
+        <w:br w:type="page"/>
       </w:r>
     </w:p>
     <w:p>
       <w:pPr>
-        <w:pStyle w:val="Heading2"/>
+        <w:pStyle w:val="Heading1"/>
       </w:pPr>
       <w:r>
-        <w:t>4.2 Hasil EDA dan Visualisasi</w:t>
+        <w:t>Temuan Visual</w:t>
       </w:r>
     </w:p>
     <w:p>
@@ -2206,7 +2141,7 @@
         <w:rPr>
           <w:sz w:val="22"/>
         </w:rPr>
-        <w:t>Gambar 4.1 Distribusi ukuran pasar UMKM per wilayah</w:t>
+        <w:t>Gambar 1 Distribusi ukuran pasar UMKM per wilayah</w:t>
       </w:r>
     </w:p>
     <w:p>
@@ -2214,7 +2149,7 @@
         <w:ind w:firstLine="567"/>
       </w:pPr>
       <w:r>
-        <w:t>Distribusi bersifat right-skew: tiga wilayah raksasa (Kabupaten Bogor 571 ribu, Kabupaten Bandung 538 ribu, Kota Bandung 524 ribu) jauh di atas median sekitar 150 ribu. Bagi SDR, pipeline prospek terkonsentrasi pada sebagian kecil wilayah, sehingga penjadwalan kunjungan dan akuisisi sebaiknya dibobot ke wilayah besar terlebih dahulu.</w:t>
+        <w:t>Distribusinya right-skew. Tiga wilayah raksasa (Kabupaten Bogor 571 ribu, Kabupaten Bandung 538 ribu, Kota Bandung 524 ribu) jauh di atas median sekitar 150 ribu. Bagi SDR, pipeline prospek terkonsentrasi pada sebagian kecil wilayah. Penjadwalan kunjungan dan akuisisi sebaiknya dibobot ke wilayah besar terlebih dahulu.</w:t>
       </w:r>
     </w:p>
     <w:p>
@@ -2265,7 +2200,7 @@
         <w:rPr>
           <w:sz w:val="22"/>
         </w:rPr>
-        <w:t>Gambar 4.2 Kepadatan sektor target ICP per wilayah</w:t>
+        <w:t>Gambar 2 Kepadatan sektor target ICP per wilayah</w:t>
       </w:r>
     </w:p>
     <w:p>
@@ -2273,7 +2208,7 @@
         <w:ind w:firstLine="567"/>
       </w:pPr>
       <w:r>
-        <w:t>Kepadatan sektor ICP berkisar 57,5 persen (Kabupaten Bandung Barat) hingga 91,3 persen (Kabupaten Kuningan); Kabupaten Kuningan, Kota Tasikmalaya, dan Kabupaten Ciamis paling murni ritel/jasa harian. Angka ini mengukur porsi ritel dan jasa harian karena F&amp;B tidak muncul pada data binaan (bias program). SDR dapat memakai peringkat ini untuk memilih wilayah dengan probabilitas product-fit tertinggi.</w:t>
+        <w:t>Kepadatan sektor ICP berkisar 57,5 persen (Kabupaten Bandung Barat) hingga 91,3 persen (Kabupaten Kuningan). Kabupaten Kuningan, Kota Tasikmalaya, dan Kabupaten Ciamis paling murni ritel/jasa harian. Angka ini mengukur porsi ritel dan jasa harian, sebab F&amp;B tidak muncul pada data binaan (bias program). SDR dapat memakai peringkat ini untuk memilih wilayah dengan probabilitas product-fit tertinggi.</w:t>
       </w:r>
     </w:p>
     <w:p>
@@ -2324,7 +2259,7 @@
         <w:rPr>
           <w:sz w:val="22"/>
         </w:rPr>
-        <w:t>Gambar 4.3 Internet vs ukuran pasar (warna = PDRB/kapita)</w:t>
+        <w:t>Gambar 3 Internet vs ukuran pasar (warna = PDRB/kapita)</w:t>
       </w:r>
     </w:p>
     <w:p>
@@ -2332,7 +2267,7 @@
         <w:ind w:firstLine="567"/>
       </w:pPr>
       <w:r>
-        <w:t>Korelasi Pearson sebesar -0,07 (praktis nol): kota-kota kecil justru paling digital (85-93 persen), sementara kabupaten besar berada pada 67-81 persen. Kesiapan digital tidak dapat menjadi proksi ukuran pasar sehingga keduanya dipertahankan sebagai komponen bobot yang terpisah.</w:t>
+        <w:t>Korelasi Pearson sebesar -0,07, praktis nol. Kota-kota kecil justru paling digital (85 sampai 93 persen), sementara kabupaten besar berada pada 67 sampai 81 persen. Kesiapan digital tidak dapat menjadi proksi ukuran pasar, sehingga keduanya dipertahankan sebagai komponen bobot yang terpisah.</w:t>
       </w:r>
     </w:p>
     <w:p>
@@ -2383,7 +2318,7 @@
         <w:rPr>
           <w:sz w:val="22"/>
         </w:rPr>
-        <w:t>Gambar 4.4 Daya beli vs adopsi pembayaran digital</w:t>
+        <w:t>Gambar 4 Daya beli vs adopsi pembayaran digital (warna = internet %)</w:t>
       </w:r>
     </w:p>
     <w:p>
@@ -2391,7 +2326,7 @@
         <w:ind w:firstLine="567"/>
       </w:pPr>
       <w:r>
-        <w:t>Korelasi sebesar +0,42 (moderat): wilayah dengan PDRB per kapita tinggi (Kota Bandung, Karawang, Bekasi) membayar pajak kendaraan secara digital jauh lebih besar per UMKM-nya (tertinggi Kota Depok). Hasil ini memvalidasi proksi e-Samsat: kebiasaan transaksi digital bergerak searah dengan daya beli, dan kuadran kanan-atas adalah wilayah dengan friksi adopsi QRIS dan analitik Klay terendah.</w:t>
+        <w:t>Korelasinya +0,42, kategori moderat. Wilayah dengan PDRB per kapita tinggi (Kota Bandung, Karawang, Bekasi) membayar pajak kendaraan secara digital jauh lebih besar per UMKM-nya; tertinggi Kota Depok. Hasil ini memvalidasi proksi e-Samsat: kebiasaan transaksi digital bergerak searah dengan daya beli. Kuadran kanan-atas adalah wilayah dengan friksi adopsi QRIS dan analitik Klay terendah.</w:t>
       </w:r>
     </w:p>
     <w:p>
@@ -2442,7 +2377,7 @@
         <w:rPr>
           <w:sz w:val="22"/>
         </w:rPr>
-        <w:t>Gambar 4.5 Komposisi sektor 12 wilayah terbesar</w:t>
+        <w:t>Gambar 5 Komposisi sektor 12 wilayah terbesar</w:t>
       </w:r>
     </w:p>
     <w:p>
@@ -2450,7 +2385,7 @@
         <w:ind w:firstLine="567"/>
       </w:pPr>
       <w:r>
-        <w:t>Ritel (terutama fashion) mendominasi UMKM binaan di semua wilayah terbesar (59-79 persen, tertinggi Kabupaten Bandung 79 persen). Kolom F&amp;B bernilai nol di seluruh wilayah karena program binaan Diskuk 2023 tidak menyentuh kuliner, padahal pada populasi F&amp;B besar. Daftar binaan bukan daftar prospek: untuk F&amp;B, SDR merujuk pada data populasi S1.</w:t>
+        <w:t>Ritel (terutama fashion) mendominasi UMKM binaan di semua wilayah terbesar (59 sampai 79 persen, tertinggi Kabupaten Bandung 79 persen). Kolom F&amp;B bernilai nol di seluruh wilayah karena program binaan Diskuk 2023 tidak menyentuh kuliner, padahal pada populasi F&amp;B besar. Daftar binaan bukan daftar prospek: untuk F&amp;B, SDR merujuk pada data populasi S1.</w:t>
       </w:r>
     </w:p>
     <w:p>
@@ -2501,7 +2436,7 @@
         <w:rPr>
           <w:sz w:val="22"/>
         </w:rPr>
-        <w:t>Gambar 4.6 Korelasi antar indikator ICP</w:t>
+        <w:t>Gambar 6 Korelasi antar indikator ICP</w:t>
       </w:r>
     </w:p>
     <w:p>
@@ -2509,15 +2444,28 @@
         <w:ind w:firstLine="567"/>
       </w:pPr>
       <w:r>
-        <w:t>Tidak ada korelasi di atas 0,6 antar indikator: kelima indikator membawa sinyal yang berbeda tanpa duplikasi berlebih. Struktur bobot 30/25/20/15/10 dengan demikian mewakili lima dimensi keputusan yang independen.</w:t>
+        <w:t>Tidak ada korelasi di atas 0,6 antar indikator. Kelima indikator membawa sinyal yang berbeda tanpa duplikasi berlebih. Struktur bobot 30/25/20/15/10 dengan demikian mewakili lima dimensi keputusan yang independen.</w:t>
+      </w:r>
+    </w:p>
+    <w:p>
+      <w:r>
+        <w:br w:type="page"/>
       </w:r>
     </w:p>
     <w:p>
       <w:pPr>
-        <w:pStyle w:val="Heading2"/>
+        <w:pStyle w:val="Heading1"/>
       </w:pPr>
       <w:r>
-        <w:t>4.3 Rancangan Bobot Indeks Prioritas</w:t>
+        <w:t>Bobot Prioritas</w:t>
+      </w:r>
+    </w:p>
+    <w:p>
+      <w:pPr>
+        <w:ind w:firstLine="567"/>
+      </w:pPr>
+      <w:r>
+        <w:t>Tabel 4 merangkum rancangan bobotnya. Total tepat 100 dan terverifikasi di kode (sum == 100). Skor indeks final, pengelompokan K-Means, Top 5 segmen, dan uji sensitivitas menjadi Milestone 2 dan tidak dikerjakan di sini.</w:t>
       </w:r>
     </w:p>
     <w:tbl>
@@ -2822,7 +2770,7 @@
               <w:rPr>
                 <w:sz w:val="22"/>
               </w:rPr>
-              <w:t>Prasyarat POS cloud dan dashboard AI; wilayah offline butuh edukasi panjang.</w:t>
+              <w:t>Prasyarat POS cloud dan dasbor AI; wilayah offline butuh edukasi panjang.</w:t>
             </w:r>
           </w:p>
         </w:tc>
@@ -3044,11 +2992,32 @@
     </w:tbl>
     <w:p/>
     <w:p>
+      <w:r>
+        <w:br w:type="page"/>
+      </w:r>
+    </w:p>
+    <w:p>
+      <w:pPr>
+        <w:pStyle w:val="Heading1"/>
+      </w:pPr>
+      <w:r>
+        <w:t>Keterbatasan dan Saran</w:t>
+      </w:r>
+    </w:p>
+    <w:p>
       <w:pPr>
         <w:ind w:firstLine="567"/>
       </w:pPr>
       <w:r>
-        <w:t>Skor indeks final, pengelompokan K-Means, Top 5 segmen, dan uji sensitivitas merupakan Milestone 2 dan tidak dikerjakan dalam laporan ini.</w:t>
+        <w:t>Empat hal perlu dicatat jujur. Pertama, fondasi data 27 kabupaten/kota berhasil disusun dari empat sumber publik mutakhir dengan seluruh angka tertelusur. Kedua, lima wilayah marjinal tereliminasi secara berprinsip sehingga analisis berfokus pada 22 wilayah yang mencakup 95,2 persen UMKM. Ketiga, pasar terkonsentrasi pada tiga wilayah besar, kota menjadi kantong digital dan adopsi sedangkan kabupaten menjadi kantong volume. Keempat, rancangan bobot 30/25/20/15/10 ditetapkan dengan justifikasi ICP dan terverifikasi berjumlah 100.</w:t>
+      </w:r>
+    </w:p>
+    <w:p>
+      <w:pPr>
+        <w:ind w:firstLine="567"/>
+      </w:pPr>
+      <w:r>
+        <w:t>Bagi SDR Skalar, prioritaskan penjadwalan ke wilayah besar bervolume tinggi. Gunakan peringkat kepadatan sektor untuk memilih angle pitch (ritel vs jasa), dan mulai dari kuadran kaya-digital untuk friksi adopsi terendah. Keterbatasan utama: S1 berlabel proyeksi; S2 hanya UMKM binaan dengan n 97 sampai 175 per wilayah dan bias fashion; e-Samsat adalah proksi, bukan QRIS. PDRB 2024 sangat sementara dan Susenas memakai sampel. Tahap berikutnya: lengkapi data F&amp;B populasi, kejar seri QRIS kab/kota bila tersedia, lalu lanjutkan ke K-Means, skoring, Top 5 segmen, dan sensitivity check.</w:t>
       </w:r>
     </w:p>
     <w:p>
@@ -3061,60 +3030,7 @@
         <w:pStyle w:val="Heading1"/>
       </w:pPr>
       <w:r>
-        <w:t>BAB V PENUTUP</w:t>
-      </w:r>
-    </w:p>
-    <w:p>
-      <w:pPr>
-        <w:pStyle w:val="Heading2"/>
-      </w:pPr>
-      <w:r>
-        <w:t>5.1 Kesimpulan</w:t>
-      </w:r>
-    </w:p>
-    <w:p>
-      <w:pPr>
-        <w:ind w:firstLine="567"/>
-      </w:pPr>
-      <w:r>
-        <w:t>Pertama, fondasi data 27 kabupaten/kota Jawa Barat berhasil disusun dari empat sumber publik mutakhir dengan seluruh angka tertelusur. Kedua, lima wilayah marjinal tereliminasi secara berprinsip sehingga analisis berfokus pada 22 wilayah yang mencakup 95,2 persen UMKM. Ketiga, pasar terkonsentrasi pada tiga wilayah besar, kota menjadi kantong digital dan adopsi sedangkan kabupaten menjadi kantong volume. Keempat, rancangan bobot 30/25/20/15/10 ditetapkan dengan justifikasi ICP dan terverifikasi berjumlah 100.</w:t>
-      </w:r>
-    </w:p>
-    <w:p>
-      <w:pPr>
-        <w:pStyle w:val="Heading2"/>
-      </w:pPr>
-      <w:r>
-        <w:t>5.2 Saran</w:t>
-      </w:r>
-    </w:p>
-    <w:p>
-      <w:pPr>
-        <w:ind w:firstLine="567"/>
-      </w:pPr>
-      <w:r>
-        <w:t>Bagi SDR Skalar: prioritaskan penjadwalan ke wilayah besar bervolume tinggi, gunakan peringkat kepadatan sektor untuk memilih angle pitch (ritel vs jasa), dan mulai dari kuadran kaya-digital untuk friksi adopsi terendah. Bagi tahap berikutnya: lengkapi data F&amp;B populasi, kejar seri QRIS kab/kota bila tersedia, lalu lanjutkan ke K-Means, skoring, Top 5 segmen, dan sensitivity check.</w:t>
-      </w:r>
-    </w:p>
-    <w:p>
-      <w:pPr>
-        <w:ind w:firstLine="567"/>
-      </w:pPr>
-      <w:r>
-        <w:t>Keterbatasan utama: S1 berlabel proyeksi; S2 hanya UMKM binaan dengan n 97-175 per wilayah dan bias fashion; e-Samsat adalah proksi bukan QRIS; PDRB 2024 sangat sementara; Susenas memakai sampel.</w:t>
-      </w:r>
-    </w:p>
-    <w:p>
-      <w:r>
-        <w:br w:type="page"/>
-      </w:r>
-    </w:p>
-    <w:p>
-      <w:pPr>
-        <w:pStyle w:val="Heading1"/>
-      </w:pPr>
-      <w:r>
-        <w:t>DAFTAR PUSTAKA</w:t>
+        <w:t>Daftar Pustaka</w:t>
       </w:r>
     </w:p>
     <w:p>
@@ -3199,7 +3115,7 @@
         <w:pStyle w:val="Heading1"/>
       </w:pPr>
       <w:r>
-        <w:t>LAMPIRAN</w:t>
+        <w:t>Lampiran</w:t>
       </w:r>
     </w:p>
     <w:p>
@@ -3207,7 +3123,7 @@
         <w:pStyle w:val="Heading2"/>
       </w:pPr>
       <w:r>
-        <w:t>Lampiran 1. Akses Notebook dan Berkas</w:t>
+        <w:t>Akses Notebook dan Berkas</w:t>
       </w:r>
     </w:p>
     <w:p>
@@ -3222,9 +3138,722 @@
     </w:p>
     <w:p>
       <w:r>
-        <w:t>Berkas data: output/ (CSV final), data/ (5 CSV sumber), assets/ (10 gambar), scripts/extract_bps_tables.py, SOURCES.md.</w:t>
+        <w:t>Berkas data: output/ (CSV final) dan data/ (5 CSV sumber). Gambar: assets/ (10 gambar). Skrip: scripts/extract_bps_tables.py. Katalog sumber: SOURCES.md.</w:t>
       </w:r>
     </w:p>
+    <w:p>
+      <w:pPr>
+        <w:pStyle w:val="Heading2"/>
+      </w:pPr>
+      <w:r>
+        <w:t>Wilayah Final</w:t>
+      </w:r>
+    </w:p>
+    <w:tbl>
+      <w:tblPr>
+        <w:tblStyle w:val="TableGrid"/>
+        <w:tblW w:type="auto" w:w="0"/>
+        <w:jc w:val="center"/>
+        <w:tblLook w:firstColumn="1" w:firstRow="1" w:lastColumn="0" w:lastRow="0" w:noHBand="0" w:noVBand="1" w:val="04A0"/>
+      </w:tblPr>
+      <w:tblGrid>
+        <w:gridCol w:w="3968"/>
+        <w:gridCol w:w="3968"/>
+      </w:tblGrid>
+      <w:tr>
+        <w:tc>
+          <w:tcPr>
+            <w:tcW w:type="dxa" w:w="3968"/>
+          </w:tcPr>
+          <w:p>
+            <w:r/>
+            <w:r>
+              <w:rPr>
+                <w:b/>
+                <w:sz w:val="22"/>
+              </w:rPr>
+              <w:t>Wilayah</w:t>
+            </w:r>
+          </w:p>
+        </w:tc>
+        <w:tc>
+          <w:tcPr>
+            <w:tcW w:type="dxa" w:w="3968"/>
+          </w:tcPr>
+          <w:p>
+            <w:r/>
+            <w:r>
+              <w:rPr>
+                <w:b/>
+                <w:sz w:val="22"/>
+              </w:rPr>
+              <w:t>Total UMKM 2023</w:t>
+            </w:r>
+          </w:p>
+        </w:tc>
+      </w:tr>
+      <w:tr>
+        <w:tc>
+          <w:tcPr>
+            <w:tcW w:type="dxa" w:w="3968"/>
+          </w:tcPr>
+          <w:p>
+            <w:r/>
+            <w:r>
+              <w:rPr>
+                <w:sz w:val="22"/>
+              </w:rPr>
+              <w:t>KABUPATEN BOGOR</w:t>
+            </w:r>
+          </w:p>
+        </w:tc>
+        <w:tc>
+          <w:tcPr>
+            <w:tcW w:type="dxa" w:w="3968"/>
+          </w:tcPr>
+          <w:p>
+            <w:r/>
+            <w:r>
+              <w:rPr>
+                <w:sz w:val="22"/>
+              </w:rPr>
+              <w:t>570.944</w:t>
+            </w:r>
+          </w:p>
+        </w:tc>
+      </w:tr>
+      <w:tr>
+        <w:tc>
+          <w:tcPr>
+            <w:tcW w:type="dxa" w:w="3968"/>
+          </w:tcPr>
+          <w:p>
+            <w:r/>
+            <w:r>
+              <w:rPr>
+                <w:sz w:val="22"/>
+              </w:rPr>
+              <w:t>KABUPATEN BANDUNG</w:t>
+            </w:r>
+          </w:p>
+        </w:tc>
+        <w:tc>
+          <w:tcPr>
+            <w:tcW w:type="dxa" w:w="3968"/>
+          </w:tcPr>
+          <w:p>
+            <w:r/>
+            <w:r>
+              <w:rPr>
+                <w:sz w:val="22"/>
+              </w:rPr>
+              <w:t>537.801</w:t>
+            </w:r>
+          </w:p>
+        </w:tc>
+      </w:tr>
+      <w:tr>
+        <w:tc>
+          <w:tcPr>
+            <w:tcW w:type="dxa" w:w="3968"/>
+          </w:tcPr>
+          <w:p>
+            <w:r/>
+            <w:r>
+              <w:rPr>
+                <w:sz w:val="22"/>
+              </w:rPr>
+              <w:t>KOTA BANDUNG</w:t>
+            </w:r>
+          </w:p>
+        </w:tc>
+        <w:tc>
+          <w:tcPr>
+            <w:tcW w:type="dxa" w:w="3968"/>
+          </w:tcPr>
+          <w:p>
+            <w:r/>
+            <w:r>
+              <w:rPr>
+                <w:sz w:val="22"/>
+              </w:rPr>
+              <w:t>523.584</w:t>
+            </w:r>
+          </w:p>
+        </w:tc>
+      </w:tr>
+      <w:tr>
+        <w:tc>
+          <w:tcPr>
+            <w:tcW w:type="dxa" w:w="3968"/>
+          </w:tcPr>
+          <w:p>
+            <w:r/>
+            <w:r>
+              <w:rPr>
+                <w:sz w:val="22"/>
+              </w:rPr>
+              <w:t>KABUPATEN SUKABUMI</w:t>
+            </w:r>
+          </w:p>
+        </w:tc>
+        <w:tc>
+          <w:tcPr>
+            <w:tcW w:type="dxa" w:w="3968"/>
+          </w:tcPr>
+          <w:p>
+            <w:r/>
+            <w:r>
+              <w:rPr>
+                <w:sz w:val="22"/>
+              </w:rPr>
+              <w:t>409.507</w:t>
+            </w:r>
+          </w:p>
+        </w:tc>
+      </w:tr>
+      <w:tr>
+        <w:tc>
+          <w:tcPr>
+            <w:tcW w:type="dxa" w:w="3968"/>
+          </w:tcPr>
+          <w:p>
+            <w:r/>
+            <w:r>
+              <w:rPr>
+                <w:sz w:val="22"/>
+              </w:rPr>
+              <w:t>KABUPATEN GARUT</w:t>
+            </w:r>
+          </w:p>
+        </w:tc>
+        <w:tc>
+          <w:tcPr>
+            <w:tcW w:type="dxa" w:w="3968"/>
+          </w:tcPr>
+          <w:p>
+            <w:r/>
+            <w:r>
+              <w:rPr>
+                <w:sz w:val="22"/>
+              </w:rPr>
+              <w:t>394.494</w:t>
+            </w:r>
+          </w:p>
+        </w:tc>
+      </w:tr>
+      <w:tr>
+        <w:tc>
+          <w:tcPr>
+            <w:tcW w:type="dxa" w:w="3968"/>
+          </w:tcPr>
+          <w:p>
+            <w:r/>
+            <w:r>
+              <w:rPr>
+                <w:sz w:val="22"/>
+              </w:rPr>
+              <w:t>KABUPATEN CIREBON</w:t>
+            </w:r>
+          </w:p>
+        </w:tc>
+        <w:tc>
+          <w:tcPr>
+            <w:tcW w:type="dxa" w:w="3968"/>
+          </w:tcPr>
+          <w:p>
+            <w:r/>
+            <w:r>
+              <w:rPr>
+                <w:sz w:val="22"/>
+              </w:rPr>
+              <w:t>384.544</w:t>
+            </w:r>
+          </w:p>
+        </w:tc>
+      </w:tr>
+      <w:tr>
+        <w:tc>
+          <w:tcPr>
+            <w:tcW w:type="dxa" w:w="3968"/>
+          </w:tcPr>
+          <w:p>
+            <w:r/>
+            <w:r>
+              <w:rPr>
+                <w:sz w:val="22"/>
+              </w:rPr>
+              <w:t>KABUPATEN CIANJUR</w:t>
+            </w:r>
+          </w:p>
+        </w:tc>
+        <w:tc>
+          <w:tcPr>
+            <w:tcW w:type="dxa" w:w="3968"/>
+          </w:tcPr>
+          <w:p>
+            <w:r/>
+            <w:r>
+              <w:rPr>
+                <w:sz w:val="22"/>
+              </w:rPr>
+              <w:t>381.810</w:t>
+            </w:r>
+          </w:p>
+        </w:tc>
+      </w:tr>
+      <w:tr>
+        <w:tc>
+          <w:tcPr>
+            <w:tcW w:type="dxa" w:w="3968"/>
+          </w:tcPr>
+          <w:p>
+            <w:r/>
+            <w:r>
+              <w:rPr>
+                <w:sz w:val="22"/>
+              </w:rPr>
+              <w:t>KABUPATEN KARAWANG</w:t>
+            </w:r>
+          </w:p>
+        </w:tc>
+        <w:tc>
+          <w:tcPr>
+            <w:tcW w:type="dxa" w:w="3968"/>
+          </w:tcPr>
+          <w:p>
+            <w:r/>
+            <w:r>
+              <w:rPr>
+                <w:sz w:val="22"/>
+              </w:rPr>
+              <w:t>355.624</w:t>
+            </w:r>
+          </w:p>
+        </w:tc>
+      </w:tr>
+      <w:tr>
+        <w:tc>
+          <w:tcPr>
+            <w:tcW w:type="dxa" w:w="3968"/>
+          </w:tcPr>
+          <w:p>
+            <w:r/>
+            <w:r>
+              <w:rPr>
+                <w:sz w:val="22"/>
+              </w:rPr>
+              <w:t>KABUPATEN BEKASI</w:t>
+            </w:r>
+          </w:p>
+        </w:tc>
+        <w:tc>
+          <w:tcPr>
+            <w:tcW w:type="dxa" w:w="3968"/>
+          </w:tcPr>
+          <w:p>
+            <w:r/>
+            <w:r>
+              <w:rPr>
+                <w:sz w:val="22"/>
+              </w:rPr>
+              <w:t>351.721</w:t>
+            </w:r>
+          </w:p>
+        </w:tc>
+      </w:tr>
+      <w:tr>
+        <w:tc>
+          <w:tcPr>
+            <w:tcW w:type="dxa" w:w="3968"/>
+          </w:tcPr>
+          <w:p>
+            <w:r/>
+            <w:r>
+              <w:rPr>
+                <w:sz w:val="22"/>
+              </w:rPr>
+              <w:t>KOTA BEKASI</w:t>
+            </w:r>
+          </w:p>
+        </w:tc>
+        <w:tc>
+          <w:tcPr>
+            <w:tcW w:type="dxa" w:w="3968"/>
+          </w:tcPr>
+          <w:p>
+            <w:r/>
+            <w:r>
+              <w:rPr>
+                <w:sz w:val="22"/>
+              </w:rPr>
+              <w:t>309.119</w:t>
+            </w:r>
+          </w:p>
+        </w:tc>
+      </w:tr>
+      <w:tr>
+        <w:tc>
+          <w:tcPr>
+            <w:tcW w:type="dxa" w:w="3968"/>
+          </w:tcPr>
+          <w:p>
+            <w:r/>
+            <w:r>
+              <w:rPr>
+                <w:sz w:val="22"/>
+              </w:rPr>
+              <w:t>KABUPATEN INDRAMAYU</w:t>
+            </w:r>
+          </w:p>
+        </w:tc>
+        <w:tc>
+          <w:tcPr>
+            <w:tcW w:type="dxa" w:w="3968"/>
+          </w:tcPr>
+          <w:p>
+            <w:r/>
+            <w:r>
+              <w:rPr>
+                <w:sz w:val="22"/>
+              </w:rPr>
+              <w:t>290.833</w:t>
+            </w:r>
+          </w:p>
+        </w:tc>
+      </w:tr>
+      <w:tr>
+        <w:tc>
+          <w:tcPr>
+            <w:tcW w:type="dxa" w:w="3968"/>
+          </w:tcPr>
+          <w:p>
+            <w:r/>
+            <w:r>
+              <w:rPr>
+                <w:sz w:val="22"/>
+              </w:rPr>
+              <w:t>KABUPATEN TASIKMALAYA</w:t>
+            </w:r>
+          </w:p>
+        </w:tc>
+        <w:tc>
+          <w:tcPr>
+            <w:tcW w:type="dxa" w:w="3968"/>
+          </w:tcPr>
+          <w:p>
+            <w:r/>
+            <w:r>
+              <w:rPr>
+                <w:sz w:val="22"/>
+              </w:rPr>
+              <w:t>286.299</w:t>
+            </w:r>
+          </w:p>
+        </w:tc>
+      </w:tr>
+      <w:tr>
+        <w:tc>
+          <w:tcPr>
+            <w:tcW w:type="dxa" w:w="3968"/>
+          </w:tcPr>
+          <w:p>
+            <w:r/>
+            <w:r>
+              <w:rPr>
+                <w:sz w:val="22"/>
+              </w:rPr>
+              <w:t>KABUPATEN SUBANG</w:t>
+            </w:r>
+          </w:p>
+        </w:tc>
+        <w:tc>
+          <w:tcPr>
+            <w:tcW w:type="dxa" w:w="3968"/>
+          </w:tcPr>
+          <w:p>
+            <w:r/>
+            <w:r>
+              <w:rPr>
+                <w:sz w:val="22"/>
+              </w:rPr>
+              <w:t>258.458</w:t>
+            </w:r>
+          </w:p>
+        </w:tc>
+      </w:tr>
+      <w:tr>
+        <w:tc>
+          <w:tcPr>
+            <w:tcW w:type="dxa" w:w="3968"/>
+          </w:tcPr>
+          <w:p>
+            <w:r/>
+            <w:r>
+              <w:rPr>
+                <w:sz w:val="22"/>
+              </w:rPr>
+              <w:t>KOTA DEPOK</w:t>
+            </w:r>
+          </w:p>
+        </w:tc>
+        <w:tc>
+          <w:tcPr>
+            <w:tcW w:type="dxa" w:w="3968"/>
+          </w:tcPr>
+          <w:p>
+            <w:r/>
+            <w:r>
+              <w:rPr>
+                <w:sz w:val="22"/>
+              </w:rPr>
+              <w:t>247.206</w:t>
+            </w:r>
+          </w:p>
+        </w:tc>
+      </w:tr>
+      <w:tr>
+        <w:tc>
+          <w:tcPr>
+            <w:tcW w:type="dxa" w:w="3968"/>
+          </w:tcPr>
+          <w:p>
+            <w:r/>
+            <w:r>
+              <w:rPr>
+                <w:sz w:val="22"/>
+              </w:rPr>
+              <w:t>KABUPATEN MAJALENGKA</w:t>
+            </w:r>
+          </w:p>
+        </w:tc>
+        <w:tc>
+          <w:tcPr>
+            <w:tcW w:type="dxa" w:w="3968"/>
+          </w:tcPr>
+          <w:p>
+            <w:r/>
+            <w:r>
+              <w:rPr>
+                <w:sz w:val="22"/>
+              </w:rPr>
+              <w:t>238.764</w:t>
+            </w:r>
+          </w:p>
+        </w:tc>
+      </w:tr>
+      <w:tr>
+        <w:tc>
+          <w:tcPr>
+            <w:tcW w:type="dxa" w:w="3968"/>
+          </w:tcPr>
+          <w:p>
+            <w:r/>
+            <w:r>
+              <w:rPr>
+                <w:sz w:val="22"/>
+              </w:rPr>
+              <w:t>KABUPATEN BANDUNG BARAT</w:t>
+            </w:r>
+          </w:p>
+        </w:tc>
+        <w:tc>
+          <w:tcPr>
+            <w:tcW w:type="dxa" w:w="3968"/>
+          </w:tcPr>
+          <w:p>
+            <w:r/>
+            <w:r>
+              <w:rPr>
+                <w:sz w:val="22"/>
+              </w:rPr>
+              <w:t>237.919</w:t>
+            </w:r>
+          </w:p>
+        </w:tc>
+      </w:tr>
+      <w:tr>
+        <w:tc>
+          <w:tcPr>
+            <w:tcW w:type="dxa" w:w="3968"/>
+          </w:tcPr>
+          <w:p>
+            <w:r/>
+            <w:r>
+              <w:rPr>
+                <w:sz w:val="22"/>
+              </w:rPr>
+              <w:t>KABUPATEN CIAMIS</w:t>
+            </w:r>
+          </w:p>
+        </w:tc>
+        <w:tc>
+          <w:tcPr>
+            <w:tcW w:type="dxa" w:w="3968"/>
+          </w:tcPr>
+          <w:p>
+            <w:r/>
+            <w:r>
+              <w:rPr>
+                <w:sz w:val="22"/>
+              </w:rPr>
+              <w:t>212.697</w:t>
+            </w:r>
+          </w:p>
+        </w:tc>
+      </w:tr>
+      <w:tr>
+        <w:tc>
+          <w:tcPr>
+            <w:tcW w:type="dxa" w:w="3968"/>
+          </w:tcPr>
+          <w:p>
+            <w:r/>
+            <w:r>
+              <w:rPr>
+                <w:sz w:val="22"/>
+              </w:rPr>
+              <w:t>KABUPATEN SUMEDANG</w:t>
+            </w:r>
+          </w:p>
+        </w:tc>
+        <w:tc>
+          <w:tcPr>
+            <w:tcW w:type="dxa" w:w="3968"/>
+          </w:tcPr>
+          <w:p>
+            <w:r/>
+            <w:r>
+              <w:rPr>
+                <w:sz w:val="22"/>
+              </w:rPr>
+              <w:t>176.898</w:t>
+            </w:r>
+          </w:p>
+        </w:tc>
+      </w:tr>
+      <w:tr>
+        <w:tc>
+          <w:tcPr>
+            <w:tcW w:type="dxa" w:w="3968"/>
+          </w:tcPr>
+          <w:p>
+            <w:r/>
+            <w:r>
+              <w:rPr>
+                <w:sz w:val="22"/>
+              </w:rPr>
+              <w:t>KABUPATEN KUNINGAN</w:t>
+            </w:r>
+          </w:p>
+        </w:tc>
+        <w:tc>
+          <w:tcPr>
+            <w:tcW w:type="dxa" w:w="3968"/>
+          </w:tcPr>
+          <w:p>
+            <w:r/>
+            <w:r>
+              <w:rPr>
+                <w:sz w:val="22"/>
+              </w:rPr>
+              <w:t>144.444</w:t>
+            </w:r>
+          </w:p>
+        </w:tc>
+      </w:tr>
+      <w:tr>
+        <w:tc>
+          <w:tcPr>
+            <w:tcW w:type="dxa" w:w="3968"/>
+          </w:tcPr>
+          <w:p>
+            <w:r/>
+            <w:r>
+              <w:rPr>
+                <w:sz w:val="22"/>
+              </w:rPr>
+              <w:t>KOTA TASIKMALAYA</w:t>
+            </w:r>
+          </w:p>
+        </w:tc>
+        <w:tc>
+          <w:tcPr>
+            <w:tcW w:type="dxa" w:w="3968"/>
+          </w:tcPr>
+          <w:p>
+            <w:r/>
+            <w:r>
+              <w:rPr>
+                <w:sz w:val="22"/>
+              </w:rPr>
+              <w:t>138.704</w:t>
+            </w:r>
+          </w:p>
+        </w:tc>
+      </w:tr>
+      <w:tr>
+        <w:tc>
+          <w:tcPr>
+            <w:tcW w:type="dxa" w:w="3968"/>
+          </w:tcPr>
+          <w:p>
+            <w:r/>
+            <w:r>
+              <w:rPr>
+                <w:sz w:val="22"/>
+              </w:rPr>
+              <w:t>KABUPATEN PURWAKARTA</w:t>
+            </w:r>
+          </w:p>
+        </w:tc>
+        <w:tc>
+          <w:tcPr>
+            <w:tcW w:type="dxa" w:w="3968"/>
+          </w:tcPr>
+          <w:p>
+            <w:r/>
+            <w:r>
+              <w:rPr>
+                <w:sz w:val="22"/>
+              </w:rPr>
+              <w:t>132.815</w:t>
+            </w:r>
+          </w:p>
+        </w:tc>
+      </w:tr>
+      <w:tr>
+        <w:tc>
+          <w:tcPr>
+            <w:tcW w:type="dxa" w:w="3968"/>
+          </w:tcPr>
+          <w:p>
+            <w:r/>
+            <w:r>
+              <w:rPr>
+                <w:sz w:val="22"/>
+              </w:rPr>
+              <w:t>KOTA BOGOR</w:t>
+            </w:r>
+          </w:p>
+        </w:tc>
+        <w:tc>
+          <w:tcPr>
+            <w:tcW w:type="dxa" w:w="3968"/>
+          </w:tcPr>
+          <w:p>
+            <w:r/>
+            <w:r>
+              <w:rPr>
+                <w:sz w:val="22"/>
+              </w:rPr>
+              <w:t>131.537</w:t>
+            </w:r>
+          </w:p>
+        </w:tc>
+      </w:tr>
+    </w:tbl>
+    <w:p/>
     <w:sectPr>
       <w:pgSz w:w="11906" w:h="16838"/>
       <w:pgMar w:top="2268" w:right="1701" w:bottom="1701" w:left="2268" w:header="720" w:footer="720" w:gutter="0"/>
@@ -3671,7 +4300,6 @@
       <w:rFonts w:asciiTheme="majorHAnsi" w:eastAsiaTheme="majorEastAsia" w:hAnsiTheme="majorHAnsi" w:cstheme="majorBidi" w:ascii="Times New Roman" w:hAnsi="Times New Roman" w:eastAsia="Times New Roman"/>
       <w:b/>
       <w:bCs/>
-      <w:caps/>
       <w:color w:val="000000"/>
       <w:sz w:val="28"/>
       <w:szCs w:val="28"/>

</xml_diff>